<commit_message>
docs: actualizar presupuesto formal servidor fisico MIGATO con arquitectura Dell OptiPlex i7 8va Gen, RAID 1 SSD y MikroTik a 900 USD
</commit_message>
<xml_diff>
--- a/PRESUPUESTO_SERVIDOR_FISICO_MIGATO_2026.docx
+++ b/PRESUPUESTO_SERVIDOR_FISICO_MIGATO_2026.docx
@@ -383,7 +383,7 @@
           <w:sz w:val="22"/>
           <w:color w:val="1E293B"/>
         </w:rPr>
-        <w:t>Para dar soporte físico autónomo a los cinco (5) módulos del sistema (Lámina 120", Comandos, Estimación del Voto, Earth Monagas 3D GIS y Dashboard de Campaña), se requiere un equipo de grado empresarial que opere de forma ininterrumpida. A diferencia de un computador convencional de escritorio, un servidor corporativo posee fuentes redundantes, ventilación balanceada para operación continua 24/7 y memoria con corrección de errores (ECC).</w:t>
+        <w:t>Para dar soporte físico autónomo a los cinco (5) módulos del sistema (Lámina 120", Comandos, Estimación del Voto, Earth Monagas 3D GIS y Dashboard de Campaña), se selecciona una arquitectura de alta eficiencia energética y excelente relación costo-rendimiento basada en una estación de trabajo corporativa Dell OptiPlex con procesador Intel Core i7 de 8va Generación y 32 GB de memoria RAM DDR4.</w:t>
       </w:r>
     </w:p>
     <w:p>
@@ -397,7 +397,7 @@
           <w:sz w:val="24"/>
           <w:color w:val="0284C7"/>
         </w:rPr>
-        <w:t>1.1. Arquitectura de Almacenamiento Híbrido Redundante (SSD + HDD en RAID 1)</w:t>
+        <w:t>1.1. Ventajas de la Plataforma Dell OptiPlex Core i7 (8va Generación)</w:t>
       </w:r>
     </w:p>
     <w:p>
@@ -410,7 +410,7 @@
           <w:sz w:val="22"/>
           <w:color w:val="1E293B"/>
         </w:rPr>
-        <w:t>El motor geoespacial de la plataforma procesa polígonos vectoriales con miles de coordenadas (incluyendo los 18 sectores comunitarios de La Puente y la segmentación de Maturín). Para evitar cuellos de botella y garantizar la supervivencia de los datos, se implementa una topología híbrida:</w:t>
+        <w:t>• Alto Desempeño por Núcleo (IPC): El procesador Intel Core i7-8700 (6 núcleos / 12 hilos a 4.6 GHz) supera ampliamente a procesadores Xeon de generaciones anteriores en el procesamiento de consultas web y motor geoespacial PostgreSQL/PostGIS.</w:t>
       </w:r>
     </w:p>
     <w:p>
@@ -423,7 +423,7 @@
           <w:sz w:val="22"/>
           <w:color w:val="1E293B"/>
         </w:rPr>
-        <w:t>• Banco de Estado Sólido (2x SSD 1TB en RAID 1 - Espejo): Destinado al Sistema Operativo Linux Ubuntu Server 24.04, motor PostgreSQL con extensión PostGIS, Nginx y caché Redis. Su velocidad de lectura/escritura superior a 500 MB/s permite que las consultas cartográficas y de votantes respondan en milisegundos.</w:t>
+        <w:t>• Eficiencia Energética (Bajo Consumo de 65W): Consume una fracción de la energía de un servidor de rack antiguo (que consumen entre 300W y 500W). Esto permite que el sistema de respaldo eléctrico (UPS) rinda más del doble de tiempo de autonomía ante los apagones de Corpoelec.</w:t>
       </w:r>
     </w:p>
     <w:p>
@@ -436,7 +436,21 @@
           <w:sz w:val="22"/>
           <w:color w:val="1E293B"/>
         </w:rPr>
-        <w:t>• Banco Mecánico Empresarial (2x HDD 2TB SAS/SATA en RAID 1 - Espejo): Destinado al almacenamiento masivo de respaldos automáticos diarios, digitalización de actas de escrutinio CNE y logs históricos de auditoría.</w:t>
+        <w:t>• Operación Silenciosa y Compacta: No requiere salas de servidores con aire acondicionado industrial ni muebles pesados de rack.</w:t>
+      </w:r>
+    </w:p>
+    <w:p>
+      <w:pPr>
+        <w:spacing w:before="180" w:after="80"/>
+        <w:jc w:val="left"/>
+      </w:pPr>
+      <w:r>
+        <w:rPr>
+          <w:b/>
+          <w:sz w:val="24"/>
+          <w:color w:val="0284C7"/>
+        </w:rPr>
+        <w:t>1.2. Arquitectura de Discos 100% Estado Sólido en RAID 1 (Espejo)</w:t>
       </w:r>
     </w:p>
     <w:p>
@@ -449,7 +463,59 @@
           <w:sz w:val="22"/>
           <w:color w:val="1E293B"/>
         </w:rPr>
-        <w:t>• Tolerancia a Fallas en Espejo: Cada archivo se escribe simultáneamente en dos unidades físicas. Si un disco sufre una avería, la controladora PERC mantiene la plataforma encendida con el disco gemelo sin pérdida de datos ni interrupción.</w:t>
+        <w:t>Se descarta el uso de discos duros mecánicos (HDD) tradicionales debido a su lentitud, fragilidad y peso. Toda la base de datos de Monagas, polígonos cartográficos y fotos de actas electorales ocupan menos de 30 GB, por lo que un sistema con discos mecánicos representaría un gasto innecesario.</w:t>
+      </w:r>
+    </w:p>
+    <w:p>
+      <w:pPr>
+        <w:jc w:val="both"/>
+        <w:spacing w:after="120" w:line="300" w:lineRule="auto"/>
+      </w:pPr>
+      <w:r>
+        <w:rPr>
+          <w:sz w:val="22"/>
+          <w:color w:val="1E293B"/>
+        </w:rPr>
+        <w:t>• Banco de Estado Sólido Dual (2x SSD 1TB SATA en RAID 1): Ambos discos operan de forma sincronizada y simultánea.</w:t>
+      </w:r>
+    </w:p>
+    <w:p>
+      <w:pPr>
+        <w:jc w:val="both"/>
+        <w:spacing w:after="120" w:line="300" w:lineRule="auto"/>
+      </w:pPr>
+      <w:r>
+        <w:rPr>
+          <w:sz w:val="22"/>
+          <w:color w:val="1E293B"/>
+        </w:rPr>
+        <w:t>• Escritura Simultánea en Espejo: Cada vez que se registra un voto, un dirigente o un acta, la información se escribe al mismo microsegundo en ambos discos.</w:t>
+      </w:r>
+    </w:p>
+    <w:p>
+      <w:pPr>
+        <w:jc w:val="both"/>
+        <w:spacing w:after="120" w:line="300" w:lineRule="auto"/>
+      </w:pPr>
+      <w:r>
+        <w:rPr>
+          <w:sz w:val="22"/>
+          <w:color w:val="1E293B"/>
+        </w:rPr>
+        <w:t>• Lectura Acelerada: El sistema lee de ambas unidades en paralelo, duplicando la velocidad de respuesta.</w:t>
+      </w:r>
+    </w:p>
+    <w:p>
+      <w:pPr>
+        <w:jc w:val="both"/>
+        <w:spacing w:after="120" w:line="300" w:lineRule="auto"/>
+      </w:pPr>
+      <w:r>
+        <w:rPr>
+          <w:sz w:val="22"/>
+          <w:color w:val="1E293B"/>
+        </w:rPr>
+        <w:t>• Tolerancia a Fallas Absoluta: Si uno de los discos SSD llegase a fallar o quemarse, el segundo disco mantiene el servidor 100% operativo sin pérdida de datos ni caída del servicio. Al colocar un disco nuevo, el sistema se reconstruye automáticamente en segundo plano.</w:t>
       </w:r>
     </w:p>
     <w:p>
@@ -463,7 +529,7 @@
           <w:sz w:val="28"/>
           <w:color w:val="0F172A"/>
         </w:rPr>
-        <w:t>CAPÍTULO II: INTEGRACIÓN DEL GATEWAY Y FIREWALL MIKROTIK</w:t>
+        <w:t>CAPÍTULO II: TOPOLOGÍA DE RED, MIKROTIK Y SWITCH GIGABIT</w:t>
       </w:r>
     </w:p>
     <w:p>
@@ -476,7 +542,7 @@
           <w:sz w:val="22"/>
           <w:color w:val="1E293B"/>
         </w:rPr>
-        <w:t>Para asegurar la puerta de enlace a internet de la Sala Situacional y proteger el servidor físico contra intrusiones o ataques de red, se incorpora un routerboard especializado MikroTik hEX (RB750Gr3), aprovechando el dominio técnico y capacidad de administración del equipo técnico de sistemas:</w:t>
+        <w:t>La infraestructura de red de la Sala Situacional se estructura en dos niveles fundamentales:</w:t>
       </w:r>
     </w:p>
     <w:p>
@@ -490,14 +556,14 @@
           <w:sz w:val="22"/>
           <w:color w:val="1E293B"/>
         </w:rPr>
-        <w:t>• SEGURIDAD Y FIREWALL SPI: </w:t>
+        <w:t>• FLUJO DE RED: </w:t>
       </w:r>
       <w:r>
         <w:rPr>
           <w:sz w:val="22"/>
           <w:color w:val="1E293B"/>
         </w:rPr>
-        <w:t>El MikroTik actúa como barrera perimetral blindada, cerrando puertos innecesarios e implementando reglas de inspección profunda de paquetes (Stateful Firewall) para que nadie en la red local o externa pueda vulnerar la base de datos PostgreSQL.</w:t>
+        <w:t>Internet Proveedor 1 / Proveedor 2 ──► MikroTik hEX RB750Gr3 (Gateway/Firewall) ──► Switch Gigabit (Distribuidor) ──► Servidor Dell + PCs de Sala + Pantallas + Videovigilancia.</w:t>
       </w:r>
     </w:p>
     <w:p>
@@ -511,14 +577,14 @@
           <w:sz w:val="22"/>
           <w:color w:val="1E293B"/>
         </w:rPr>
-        <w:t>• CONMUTACIÓN AUTOMÁTICA (FAILOVER): </w:t>
+        <w:t>• 1. Router Gateway MikroTik hEX: </w:t>
       </w:r>
       <w:r>
         <w:rPr>
           <w:sz w:val="22"/>
           <w:color w:val="1E293B"/>
         </w:rPr>
-        <w:t>Permite conectar simultáneamente dos proveedores de internet (ej. WAN 1: Fibra Principal CANTV/Inter/NetUno y WAN 2: Enlace de Respaldo Starlink o Módem LTE). En caso de corte en la fibra óptica, el MikroTik conmuta el tráfico en menos de 1 segundo sin interrumpir el funcionamiento del servidor.</w:t>
+        <w:t>Actúa como la puerta de enlace física y cortafuegos perimetral. Realiza conmutación automática de internet (Failover) entre dos proveedores para que la sala nunca se quede sin conexión, y provee túnel VPN seguro (WireGuard) para acceso remoto.</w:t>
       </w:r>
     </w:p>
     <w:p>
@@ -532,14 +598,35 @@
           <w:sz w:val="22"/>
           <w:color w:val="1E293B"/>
         </w:rPr>
-        <w:t>• SERVIDOR VPN SEGURO (WIREGUARD): </w:t>
+        <w:t>• 2. Switch Gigabit de Sala (Hikvision / TP-Link): </w:t>
       </w:r>
       <w:r>
         <w:rPr>
           <w:sz w:val="22"/>
           <w:color w:val="1E293B"/>
         </w:rPr>
-        <w:t>Permite al Ingeniero Responsable y a los directivos del Comando conectarse de forma remota y cifrada al servidor desde laptops o dispositivos móviles fuera de la sede, sin exponer la plataforma a los riesgos de la internet pública.</w:t>
+        <w:t>El MikroTik posee 5 puertos, por lo que se requiere un switch Gigabit (marca Hikvision o TP-Link) de 16 puertos conectado directamente a él para multiplicar las bocas de red y enlazar el servidor, las computadoras de los operadores, las pantallas de sala y futuras cámaras de seguridad.</w:t>
+      </w:r>
+    </w:p>
+    <w:p>
+      <w:pPr>
+        <w:jc w:val="both"/>
+        <w:spacing w:after="120" w:line="300" w:lineRule="auto"/>
+      </w:pPr>
+      <w:r>
+        <w:rPr>
+          <w:b/>
+          <w:sz w:val="22"/>
+          <w:color w:val="1E293B"/>
+        </w:rPr>
+        <w:t>• 3. Bobina de Cableado Cat6 (305 metros): </w:t>
+      </w:r>
+      <w:r>
+        <w:rPr>
+          <w:sz w:val="22"/>
+          <w:color w:val="1E293B"/>
+        </w:rPr>
+        <w:t>Se incorpora una bobina completa de 305 metros de cable UTP Cat6 para realizar el cableado estructurado formal de la sala, oficinas del comando y las conexiones a los equipos de cómputo y cámaras.</w:t>
       </w:r>
     </w:p>
     <w:p>
@@ -625,7 +712,7 @@
                 <w:sz w:val="19"/>
                 <w:color w:val="FFFFFF"/>
               </w:rPr>
-              <w:t>Especificación Técnica</w:t>
+              <w:t>Especificación Técnica Real</w:t>
             </w:r>
           </w:p>
         </w:tc>
@@ -703,25 +790,25 @@
                 <w:sz w:val="18"/>
                 <w:color w:val="0F172A"/>
               </w:rPr>
-              <w:t>Servidor Torre Dell PowerEdge</w:t>
-            </w:r>
-          </w:p>
-        </w:tc>
-        <w:tc>
-          <w:tcPr>
-            <w:shd w:val="clear" w:color="auto" w:fill="FFFFFF"/>
-          </w:tcPr>
-          <w:p>
-            <w:pPr>
-              <w:spacing w:after="0"/>
-              <w:jc w:val="left"/>
-            </w:pPr>
-            <w:r>
-              <w:rPr>
-                <w:sz w:val="18"/>
-                <w:color w:val="334155"/>
-              </w:rPr>
-              <w:t>Modelo T330/T430 (Xeon 8 Cores, 64GB RAM ECC, 2 Fuentes Hot-Plug, Controladora PERC)</w:t>
+              <w:t>Computador Servidor Dell OptiPlex</w:t>
+            </w:r>
+          </w:p>
+        </w:tc>
+        <w:tc>
+          <w:tcPr>
+            <w:shd w:val="clear" w:color="auto" w:fill="FFFFFF"/>
+          </w:tcPr>
+          <w:p>
+            <w:pPr>
+              <w:spacing w:after="0"/>
+              <w:jc w:val="left"/>
+            </w:pPr>
+            <w:r>
+              <w:rPr>
+                <w:sz w:val="18"/>
+                <w:color w:val="334155"/>
+              </w:rPr>
+              <w:t>Core i7 8va Gen (i7-8700 6C/12T), 32GB RAM DDR4, Chasis Torre/SFF silencioso</w:t>
             </w:r>
           </w:p>
         </w:tc>
@@ -757,7 +844,7 @@
                 <w:sz w:val="18"/>
                 <w:color w:val="334155"/>
               </w:rPr>
-              <w:t>$1,200.00</w:t>
+              <w:t>$230.00</w:t>
             </w:r>
           </w:p>
         </w:tc>
@@ -775,7 +862,7 @@
                 <w:sz w:val="18"/>
                 <w:color w:val="334155"/>
               </w:rPr>
-              <w:t>$1,200.00</w:t>
+              <w:t>$230.00</w:t>
             </w:r>
           </w:p>
         </w:tc>
@@ -814,7 +901,7 @@
                 <w:sz w:val="18"/>
                 <w:color w:val="334155"/>
               </w:rPr>
-              <w:t>Kingston KC600 / Crucial MX500 / Samsung 870 EVO SATA 2.5" (Sistema &amp; BD)</w:t>
+              <w:t>2x SSD 1TB SATA 2.5" Kingston KC600 / Crucial MX500 en Espejo (Sistema &amp; Datos)</w:t>
             </w:r>
           </w:p>
         </w:tc>
@@ -850,7 +937,7 @@
                 <w:sz w:val="18"/>
                 <w:color w:val="334155"/>
               </w:rPr>
-              <w:t>$140.00</w:t>
+              <w:t>$120.00</w:t>
             </w:r>
           </w:p>
         </w:tc>
@@ -868,7 +955,7 @@
                 <w:sz w:val="18"/>
                 <w:color w:val="334155"/>
               </w:rPr>
-              <w:t>$280.00</w:t>
+              <w:t>$240.00</w:t>
             </w:r>
           </w:p>
         </w:tc>
@@ -889,43 +976,43 @@
                 <w:sz w:val="18"/>
                 <w:color w:val="0F172A"/>
               </w:rPr>
-              <w:t>Discos Duros HDD 2TB (RAID 1)</w:t>
-            </w:r>
-          </w:p>
-        </w:tc>
-        <w:tc>
-          <w:tcPr>
-            <w:shd w:val="clear" w:color="auto" w:fill="FFFFFF"/>
-          </w:tcPr>
-          <w:p>
-            <w:pPr>
-              <w:spacing w:after="0"/>
-              <w:jc w:val="left"/>
-            </w:pPr>
-            <w:r>
-              <w:rPr>
-                <w:sz w:val="18"/>
-                <w:color w:val="334155"/>
-              </w:rPr>
-              <w:t>Dell Constellation / WD Red Plus Enterprise 7.200 RPM SAS/SATA (Backups &amp; Actas)</w:t>
-            </w:r>
-          </w:p>
-        </w:tc>
-        <w:tc>
-          <w:tcPr>
-            <w:shd w:val="clear" w:color="auto" w:fill="FFFFFF"/>
-          </w:tcPr>
-          <w:p>
-            <w:pPr>
-              <w:spacing w:after="0"/>
-              <w:jc w:val="left"/>
-            </w:pPr>
-            <w:r>
-              <w:rPr>
-                <w:sz w:val="18"/>
-                <w:color w:val="334155"/>
-              </w:rPr>
-              <w:t>2</w:t>
+              <w:t>Gateway MikroTik RouterBOARD</w:t>
+            </w:r>
+          </w:p>
+        </w:tc>
+        <w:tc>
+          <w:tcPr>
+            <w:shd w:val="clear" w:color="auto" w:fill="FFFFFF"/>
+          </w:tcPr>
+          <w:p>
+            <w:pPr>
+              <w:spacing w:after="0"/>
+              <w:jc w:val="left"/>
+            </w:pPr>
+            <w:r>
+              <w:rPr>
+                <w:sz w:val="18"/>
+                <w:color w:val="334155"/>
+              </w:rPr>
+              <w:t>MikroTik hEX RB750Gr3 (Dual Core 880MHz, 256MB RAM, 5 Puertos Gigabit, RouterOS)</w:t>
+            </w:r>
+          </w:p>
+        </w:tc>
+        <w:tc>
+          <w:tcPr>
+            <w:shd w:val="clear" w:color="auto" w:fill="FFFFFF"/>
+          </w:tcPr>
+          <w:p>
+            <w:pPr>
+              <w:spacing w:after="0"/>
+              <w:jc w:val="left"/>
+            </w:pPr>
+            <w:r>
+              <w:rPr>
+                <w:sz w:val="18"/>
+                <w:color w:val="334155"/>
+              </w:rPr>
+              <w:t>1</w:t>
             </w:r>
           </w:p>
         </w:tc>
@@ -943,7 +1030,7 @@
                 <w:sz w:val="18"/>
                 <w:color w:val="334155"/>
               </w:rPr>
-              <w:t>$190.00</w:t>
+              <w:t>$105.00</w:t>
             </w:r>
           </w:p>
         </w:tc>
@@ -961,7 +1048,7 @@
                 <w:sz w:val="18"/>
                 <w:color w:val="334155"/>
               </w:rPr>
-              <w:t>$380.00</w:t>
+              <w:t>$105.00</w:t>
             </w:r>
           </w:p>
         </w:tc>
@@ -982,43 +1069,43 @@
                 <w:sz w:val="18"/>
                 <w:color w:val="0F172A"/>
               </w:rPr>
-              <w:t>Bandejas Caddys Dell</w:t>
-            </w:r>
-          </w:p>
-        </w:tc>
-        <w:tc>
-          <w:tcPr>
-            <w:shd w:val="clear" w:color="auto" w:fill="F8FAFC"/>
-          </w:tcPr>
-          <w:p>
-            <w:pPr>
-              <w:spacing w:after="0"/>
-              <w:jc w:val="left"/>
-            </w:pPr>
-            <w:r>
-              <w:rPr>
-                <w:sz w:val="18"/>
-                <w:color w:val="334155"/>
-              </w:rPr>
-              <w:t>Bandejas originales con seguro Hot-Plug para bahías de 3.5"/2.5"</w:t>
-            </w:r>
-          </w:p>
-        </w:tc>
-        <w:tc>
-          <w:tcPr>
-            <w:shd w:val="clear" w:color="auto" w:fill="F8FAFC"/>
-          </w:tcPr>
-          <w:p>
-            <w:pPr>
-              <w:spacing w:after="0"/>
-              <w:jc w:val="left"/>
-            </w:pPr>
-            <w:r>
-              <w:rPr>
-                <w:sz w:val="18"/>
-                <w:color w:val="334155"/>
-              </w:rPr>
-              <w:t>4</w:t>
+              <w:t>Switch de Distribución de Red</w:t>
+            </w:r>
+          </w:p>
+        </w:tc>
+        <w:tc>
+          <w:tcPr>
+            <w:shd w:val="clear" w:color="auto" w:fill="F8FAFC"/>
+          </w:tcPr>
+          <w:p>
+            <w:pPr>
+              <w:spacing w:after="0"/>
+              <w:jc w:val="left"/>
+            </w:pPr>
+            <w:r>
+              <w:rPr>
+                <w:sz w:val="18"/>
+                <w:color w:val="334155"/>
+              </w:rPr>
+              <w:t>Switch Hikvision / TP-Link 16 Puertos Gigabit 10/100/1000 Mbps metálico</w:t>
+            </w:r>
+          </w:p>
+        </w:tc>
+        <w:tc>
+          <w:tcPr>
+            <w:shd w:val="clear" w:color="auto" w:fill="F8FAFC"/>
+          </w:tcPr>
+          <w:p>
+            <w:pPr>
+              <w:spacing w:after="0"/>
+              <w:jc w:val="left"/>
+            </w:pPr>
+            <w:r>
+              <w:rPr>
+                <w:sz w:val="18"/>
+                <w:color w:val="334155"/>
+              </w:rPr>
+              <w:t>1</w:t>
             </w:r>
           </w:p>
         </w:tc>
@@ -1036,7 +1123,7 @@
                 <w:sz w:val="18"/>
                 <w:color w:val="334155"/>
               </w:rPr>
-              <w:t>$22.50</w:t>
+              <w:t>$65.00</w:t>
             </w:r>
           </w:p>
         </w:tc>
@@ -1054,7 +1141,7 @@
                 <w:sz w:val="18"/>
                 <w:color w:val="334155"/>
               </w:rPr>
-              <w:t>$90.00</w:t>
+              <w:t>$65.00</w:t>
             </w:r>
           </w:p>
         </w:tc>
@@ -1075,25 +1162,25 @@
                 <w:sz w:val="18"/>
                 <w:color w:val="0F172A"/>
               </w:rPr>
-              <w:t>Gateway MikroTik RouterBOARD</w:t>
-            </w:r>
-          </w:p>
-        </w:tc>
-        <w:tc>
-          <w:tcPr>
-            <w:shd w:val="clear" w:color="auto" w:fill="FFFFFF"/>
-          </w:tcPr>
-          <w:p>
-            <w:pPr>
-              <w:spacing w:after="0"/>
-              <w:jc w:val="left"/>
-            </w:pPr>
-            <w:r>
-              <w:rPr>
-                <w:sz w:val="18"/>
-                <w:color w:val="334155"/>
-              </w:rPr>
-              <w:t>MikroTik hEX RB750Gr3 (Dual Core 880MHz, 256MB RAM, 5 Puertos Gigabit, RouterOS)</w:t>
+              <w:t>Bobina Cable UTP Cat6 (305m)</w:t>
+            </w:r>
+          </w:p>
+        </w:tc>
+        <w:tc>
+          <w:tcPr>
+            <w:shd w:val="clear" w:color="auto" w:fill="FFFFFF"/>
+          </w:tcPr>
+          <w:p>
+            <w:pPr>
+              <w:spacing w:after="0"/>
+              <w:jc w:val="left"/>
+            </w:pPr>
+            <w:r>
+              <w:rPr>
+                <w:sz w:val="18"/>
+                <w:color w:val="334155"/>
+              </w:rPr>
+              <w:t>Bobina 305 metros Cat6 interior de alta velocidad + caja de 100 conectores RJ45</w:t>
             </w:r>
           </w:p>
         </w:tc>
@@ -1129,7 +1216,7 @@
                 <w:sz w:val="18"/>
                 <w:color w:val="334155"/>
               </w:rPr>
-              <w:t>$105.00</w:t>
+              <w:t>$95.00</w:t>
             </w:r>
           </w:p>
         </w:tc>
@@ -1147,7 +1234,7 @@
                 <w:sz w:val="18"/>
                 <w:color w:val="334155"/>
               </w:rPr>
-              <w:t>$105.00</w:t>
+              <w:t>$95.00</w:t>
             </w:r>
           </w:p>
         </w:tc>
@@ -1186,7 +1273,7 @@
                 <w:sz w:val="18"/>
                 <w:color w:val="334155"/>
               </w:rPr>
-              <w:t>UPS 2.000 VA Interactivo con supresor de picos industrial (30 a 45 min autonomía)</w:t>
+              <w:t>UPS 1.200 VA a 1.500 VA con supresor de picos (45 a 60 min autonomía con bajo consumo)</w:t>
             </w:r>
           </w:p>
         </w:tc>
@@ -1222,7 +1309,7 @@
                 <w:sz w:val="18"/>
                 <w:color w:val="334155"/>
               </w:rPr>
-              <w:t>$320.00</w:t>
+              <w:t>$165.00</w:t>
             </w:r>
           </w:p>
         </w:tc>
@@ -1240,7 +1327,7 @@
                 <w:sz w:val="18"/>
                 <w:color w:val="334155"/>
               </w:rPr>
-              <w:t>$320.00</w:t>
+              <w:t>$165.00</w:t>
             </w:r>
           </w:p>
         </w:tc>
@@ -1248,62 +1335,83 @@
       <w:tr>
         <w:tc>
           <w:tcPr>
-            <w:shd w:val="clear" w:color="auto" w:fill="FFFFFF"/>
-          </w:tcPr>
-          <w:p>
-            <w:pPr>
-              <w:spacing w:after="0"/>
-              <w:jc w:val="left"/>
-            </w:pPr>
-            <w:r>
-              <w:rPr>
-                <w:b/>
-                <w:sz w:val="18"/>
-                <w:color w:val="0F172A"/>
-              </w:rPr>
-              <w:t>Switch de Distribución de Sala</w:t>
-            </w:r>
-          </w:p>
-        </w:tc>
-        <w:tc>
-          <w:tcPr>
-            <w:shd w:val="clear" w:color="auto" w:fill="FFFFFF"/>
-          </w:tcPr>
-          <w:p>
-            <w:pPr>
-              <w:spacing w:after="0"/>
-              <w:jc w:val="left"/>
-            </w:pPr>
-            <w:r>
-              <w:rPr>
-                <w:sz w:val="18"/>
-                <w:color w:val="334155"/>
-              </w:rPr>
-              <w:t>Switch Gigabit 16 Puertos 10/100/1000 Mbps TP-Link / D-Link metálico</w:t>
-            </w:r>
-          </w:p>
-        </w:tc>
-        <w:tc>
-          <w:tcPr>
-            <w:shd w:val="clear" w:color="auto" w:fill="FFFFFF"/>
-          </w:tcPr>
-          <w:p>
-            <w:pPr>
-              <w:spacing w:after="0"/>
-              <w:jc w:val="left"/>
-            </w:pPr>
-            <w:r>
-              <w:rPr>
-                <w:sz w:val="18"/>
-                <w:color w:val="334155"/>
-              </w:rPr>
-              <w:t>1</w:t>
-            </w:r>
-          </w:p>
-        </w:tc>
-        <w:tc>
-          <w:tcPr>
-            <w:shd w:val="clear" w:color="auto" w:fill="FFFFFF"/>
+            <w:shd w:val="clear" w:color="auto" w:fill="FEF3C7"/>
+          </w:tcPr>
+          <w:p>
+            <w:pPr>
+              <w:spacing w:after="0"/>
+              <w:jc w:val="left"/>
+            </w:pPr>
+            <w:r>
+              <w:rPr>
+                <w:b/>
+                <w:sz w:val="18"/>
+                <w:color w:val="0F172A"/>
+              </w:rPr>
+              <w:t>TOTAL GENERAL DE INVERSIÓN FÍSICA</w:t>
+            </w:r>
+          </w:p>
+        </w:tc>
+        <w:tc>
+          <w:tcPr>
+            <w:shd w:val="clear" w:color="auto" w:fill="FEF3C7"/>
+          </w:tcPr>
+          <w:p>
+            <w:pPr>
+              <w:spacing w:after="0"/>
+              <w:jc w:val="left"/>
+            </w:pPr>
+            <w:r>
+              <w:rPr>
+                <w:b/>
+                <w:sz w:val="18"/>
+                <w:color w:val="0F172A"/>
+              </w:rPr>
+              <w:t>Equipamiento completo optimizado de servidor, almacenamiento RAID, red y protección</w:t>
+            </w:r>
+          </w:p>
+        </w:tc>
+        <w:tc>
+          <w:tcPr>
+            <w:shd w:val="clear" w:color="auto" w:fill="FEF3C7"/>
+          </w:tcPr>
+          <w:p>
+            <w:pPr>
+              <w:spacing w:after="0"/>
+              <w:jc w:val="left"/>
+            </w:pPr>
+            <w:r>
+              <w:rPr>
+                <w:b/>
+                <w:sz w:val="18"/>
+                <w:color w:val="0F172A"/>
+              </w:rPr>
+              <w:t>—</w:t>
+            </w:r>
+          </w:p>
+        </w:tc>
+        <w:tc>
+          <w:tcPr>
+            <w:shd w:val="clear" w:color="auto" w:fill="FEF3C7"/>
+          </w:tcPr>
+          <w:p>
+            <w:pPr>
+              <w:spacing w:after="0"/>
+              <w:jc w:val="left"/>
+            </w:pPr>
+            <w:r>
+              <w:rPr>
+                <w:b/>
+                <w:sz w:val="18"/>
+                <w:color w:val="0F172A"/>
+              </w:rPr>
+              <w:t>—</w:t>
+            </w:r>
+          </w:p>
+        </w:tc>
+        <w:tc>
+          <w:tcPr>
+            <w:shd w:val="clear" w:color="auto" w:fill="FEF3C7"/>
           </w:tcPr>
           <w:p>
             <w:pPr>
@@ -1312,218 +1420,11 @@
             </w:pPr>
             <w:r>
               <w:rPr>
-                <w:sz w:val="18"/>
-                <w:color w:val="334155"/>
-              </w:rPr>
-              <w:t>$65.00</w:t>
-            </w:r>
-          </w:p>
-        </w:tc>
-        <w:tc>
-          <w:tcPr>
-            <w:shd w:val="clear" w:color="auto" w:fill="FFFFFF"/>
-          </w:tcPr>
-          <w:p>
-            <w:pPr>
-              <w:spacing w:after="0"/>
-              <w:jc w:val="right"/>
-            </w:pPr>
-            <w:r>
-              <w:rPr>
-                <w:sz w:val="18"/>
-                <w:color w:val="334155"/>
-              </w:rPr>
-              <w:t>$65.00</w:t>
-            </w:r>
-          </w:p>
-        </w:tc>
-      </w:tr>
-      <w:tr>
-        <w:tc>
-          <w:tcPr>
-            <w:shd w:val="clear" w:color="auto" w:fill="F8FAFC"/>
-          </w:tcPr>
-          <w:p>
-            <w:pPr>
-              <w:spacing w:after="0"/>
-              <w:jc w:val="left"/>
-            </w:pPr>
-            <w:r>
-              <w:rPr>
-                <w:b/>
-                <w:sz w:val="18"/>
-                <w:color w:val="0F172A"/>
-              </w:rPr>
-              <w:t>Cableado y Accesorios</w:t>
-            </w:r>
-          </w:p>
-        </w:tc>
-        <w:tc>
-          <w:tcPr>
-            <w:shd w:val="clear" w:color="auto" w:fill="F8FAFC"/>
-          </w:tcPr>
-          <w:p>
-            <w:pPr>
-              <w:spacing w:after="0"/>
-              <w:jc w:val="right"/>
-            </w:pPr>
-            <w:r>
-              <w:rPr>
-                <w:sz w:val="18"/>
-                <w:color w:val="334155"/>
-              </w:rPr>
-              <w:t>Bobina/Patch Cords Cat6 100% Cobre blindado + regleta industrial</w:t>
-            </w:r>
-          </w:p>
-        </w:tc>
-        <w:tc>
-          <w:tcPr>
-            <w:shd w:val="clear" w:color="auto" w:fill="F8FAFC"/>
-          </w:tcPr>
-          <w:p>
-            <w:pPr>
-              <w:spacing w:after="0"/>
-              <w:jc w:val="left"/>
-            </w:pPr>
-            <w:r>
-              <w:rPr>
-                <w:sz w:val="18"/>
-                <w:color w:val="334155"/>
-              </w:rPr>
-              <w:t>1</w:t>
-            </w:r>
-          </w:p>
-        </w:tc>
-        <w:tc>
-          <w:tcPr>
-            <w:shd w:val="clear" w:color="auto" w:fill="F8FAFC"/>
-          </w:tcPr>
-          <w:p>
-            <w:pPr>
-              <w:spacing w:after="0"/>
-              <w:jc w:val="right"/>
-            </w:pPr>
-            <w:r>
-              <w:rPr>
-                <w:sz w:val="18"/>
-                <w:color w:val="334155"/>
-              </w:rPr>
-              <w:t>$40.00</w:t>
-            </w:r>
-          </w:p>
-        </w:tc>
-        <w:tc>
-          <w:tcPr>
-            <w:shd w:val="clear" w:color="auto" w:fill="F8FAFC"/>
-          </w:tcPr>
-          <w:p>
-            <w:pPr>
-              <w:spacing w:after="0"/>
-              <w:jc w:val="right"/>
-            </w:pPr>
-            <w:r>
-              <w:rPr>
-                <w:sz w:val="18"/>
-                <w:color w:val="334155"/>
-              </w:rPr>
-              <w:t>$40.00</w:t>
-            </w:r>
-          </w:p>
-        </w:tc>
-      </w:tr>
-      <w:tr>
-        <w:tc>
-          <w:tcPr>
-            <w:shd w:val="clear" w:color="auto" w:fill="FEF3C7"/>
-          </w:tcPr>
-          <w:p>
-            <w:pPr>
-              <w:spacing w:after="0"/>
-              <w:jc w:val="left"/>
-            </w:pPr>
-            <w:r>
-              <w:rPr>
-                <w:b/>
-                <w:sz w:val="18"/>
-                <w:color w:val="0F172A"/>
-              </w:rPr>
-              <w:t>TOTAL GENERAL DE INVERSIÓN FÍSICA</w:t>
-            </w:r>
-          </w:p>
-        </w:tc>
-        <w:tc>
-          <w:tcPr>
-            <w:shd w:val="clear" w:color="auto" w:fill="FEF3C7"/>
-          </w:tcPr>
-          <w:p>
-            <w:pPr>
-              <w:spacing w:after="0"/>
-              <w:jc w:val="left"/>
-            </w:pPr>
-            <w:r>
-              <w:rPr>
-                <w:b/>
-                <w:sz w:val="18"/>
-                <w:color w:val="0F172A"/>
-              </w:rPr>
-              <w:t>Equipamiento completo de cómputo, almacenamiento, red y respaldo eléctrico</w:t>
-            </w:r>
-          </w:p>
-        </w:tc>
-        <w:tc>
-          <w:tcPr>
-            <w:shd w:val="clear" w:color="auto" w:fill="FEF3C7"/>
-          </w:tcPr>
-          <w:p>
-            <w:pPr>
-              <w:spacing w:after="0"/>
-              <w:jc w:val="left"/>
-            </w:pPr>
-            <w:r>
-              <w:rPr>
-                <w:b/>
-                <w:sz w:val="18"/>
-                <w:color w:val="0F172A"/>
-              </w:rPr>
-              <w:t>—</w:t>
-            </w:r>
-          </w:p>
-        </w:tc>
-        <w:tc>
-          <w:tcPr>
-            <w:shd w:val="clear" w:color="auto" w:fill="FEF3C7"/>
-          </w:tcPr>
-          <w:p>
-            <w:pPr>
-              <w:spacing w:after="0"/>
-              <w:jc w:val="left"/>
-            </w:pPr>
-            <w:r>
-              <w:rPr>
-                <w:b/>
-                <w:sz w:val="18"/>
-                <w:color w:val="0F172A"/>
-              </w:rPr>
-              <w:t>—</w:t>
-            </w:r>
-          </w:p>
-        </w:tc>
-        <w:tc>
-          <w:tcPr>
-            <w:shd w:val="clear" w:color="auto" w:fill="FEF3C7"/>
-          </w:tcPr>
-          <w:p>
-            <w:pPr>
-              <w:spacing w:after="0"/>
-              <w:jc w:val="right"/>
-            </w:pPr>
-            <w:r>
-              <w:rPr>
-                <w:b/>
-                <w:sz w:val="18"/>
-                <w:color w:val="0F172A"/>
-              </w:rPr>
-              <w:t>$2,480.00 USD</w:t>
+                <w:b/>
+                <w:sz w:val="18"/>
+                <w:color w:val="0F172A"/>
+              </w:rPr>
+              <w:t>$900.00 USD</w:t>
             </w:r>
           </w:p>
         </w:tc>
@@ -1558,7 +1459,7 @@
           <w:sz w:val="22"/>
           <w:color w:val="1E293B"/>
         </w:rPr>
-        <w:t>Para otorgar flexibilidad presupuestaria a la Dirección General de MIGATO, se presentan tres alternativas consolidadas:</w:t>
+        <w:t>Para otorgar claridad técnico-económica a la Dirección General de MIGATO, se contrastan las alternativas evaluadas:</w:t>
       </w:r>
     </w:p>
     <w:tbl>
@@ -1676,43 +1577,43 @@
                 <w:sz w:val="18"/>
                 <w:color w:val="0F172A"/>
               </w:rPr>
-              <w:t>Opción 1: Esencial</w:t>
-            </w:r>
-          </w:p>
-        </w:tc>
-        <w:tc>
-          <w:tcPr>
-            <w:shd w:val="clear" w:color="auto" w:fill="FFFFFF"/>
-          </w:tcPr>
-          <w:p>
-            <w:pPr>
-              <w:spacing w:after="0"/>
-              <w:jc w:val="left"/>
-            </w:pPr>
-            <w:r>
-              <w:rPr>
-                <w:sz w:val="18"/>
-                <w:color w:val="334155"/>
-              </w:rPr>
-              <w:t>Servidor Torre + 2 SSD 1TB + UPS 1.500 VA + Switch 8 bocas</w:t>
-            </w:r>
-          </w:p>
-        </w:tc>
-        <w:tc>
-          <w:tcPr>
-            <w:shd w:val="clear" w:color="auto" w:fill="FFFFFF"/>
-          </w:tcPr>
-          <w:p>
-            <w:pPr>
-              <w:spacing w:after="0"/>
-              <w:jc w:val="left"/>
-            </w:pPr>
-            <w:r>
-              <w:rPr>
-                <w:sz w:val="18"/>
-                <w:color w:val="334155"/>
-              </w:rPr>
-              <w:t>20 a 30 minutos</w:t>
+              <w:t>Opción 1: Recomendada ★</w:t>
+            </w:r>
+          </w:p>
+        </w:tc>
+        <w:tc>
+          <w:tcPr>
+            <w:shd w:val="clear" w:color="auto" w:fill="FFFFFF"/>
+          </w:tcPr>
+          <w:p>
+            <w:pPr>
+              <w:spacing w:after="0"/>
+              <w:jc w:val="left"/>
+            </w:pPr>
+            <w:r>
+              <w:rPr>
+                <w:sz w:val="18"/>
+                <w:color w:val="334155"/>
+              </w:rPr>
+              <w:t>Dell OptiPlex Core i7 (8va Gen 6C/12T), 32GB RAM + 2x SSD 1TB RAID 1 + MikroTik hEX + Switch 16p + Cat6 305m + UPS 1.500VA</w:t>
+            </w:r>
+          </w:p>
+        </w:tc>
+        <w:tc>
+          <w:tcPr>
+            <w:shd w:val="clear" w:color="auto" w:fill="FFFFFF"/>
+          </w:tcPr>
+          <w:p>
+            <w:pPr>
+              <w:spacing w:after="0"/>
+              <w:jc w:val="left"/>
+            </w:pPr>
+            <w:r>
+              <w:rPr>
+                <w:sz w:val="18"/>
+                <w:color w:val="334155"/>
+              </w:rPr>
+              <w:t>45 a 60 minutos (Bajo consumo 65W)</w:t>
             </w:r>
           </w:p>
         </w:tc>
@@ -1730,7 +1631,7 @@
                 <w:sz w:val="18"/>
                 <w:color w:val="334155"/>
               </w:rPr>
-              <w:t>$1,550.00 USD</w:t>
+              <w:t>$900.00 USD</w:t>
             </w:r>
           </w:p>
         </w:tc>
@@ -1751,43 +1652,43 @@
                 <w:sz w:val="18"/>
                 <w:color w:val="0F172A"/>
               </w:rPr>
-              <w:t>Opción 2: Recomendada ★</w:t>
-            </w:r>
-          </w:p>
-        </w:tc>
-        <w:tc>
-          <w:tcPr>
-            <w:shd w:val="clear" w:color="auto" w:fill="F8FAFC"/>
-          </w:tcPr>
-          <w:p>
-            <w:pPr>
-              <w:spacing w:after="0"/>
-              <w:jc w:val="left"/>
-            </w:pPr>
-            <w:r>
-              <w:rPr>
-                <w:sz w:val="18"/>
-                <w:color w:val="334155"/>
-              </w:rPr>
-              <w:t>Servidor Torre + 2 SSD 1TB + 2 HDD 2TB + MikroTik hEX + UPS 2.000 VA + Switch 16 bocas</w:t>
-            </w:r>
-          </w:p>
-        </w:tc>
-        <w:tc>
-          <w:tcPr>
-            <w:shd w:val="clear" w:color="auto" w:fill="F8FAFC"/>
-          </w:tcPr>
-          <w:p>
-            <w:pPr>
-              <w:spacing w:after="0"/>
-              <w:jc w:val="left"/>
-            </w:pPr>
-            <w:r>
-              <w:rPr>
-                <w:sz w:val="18"/>
-                <w:color w:val="334155"/>
-              </w:rPr>
-              <w:t>30 a 45 minutos</w:t>
+              <w:t>Opción 2: Entrada Básica</w:t>
+            </w:r>
+          </w:p>
+        </w:tc>
+        <w:tc>
+          <w:tcPr>
+            <w:shd w:val="clear" w:color="auto" w:fill="F8FAFC"/>
+          </w:tcPr>
+          <w:p>
+            <w:pPr>
+              <w:spacing w:after="0"/>
+              <w:jc w:val="left"/>
+            </w:pPr>
+            <w:r>
+              <w:rPr>
+                <w:sz w:val="18"/>
+                <w:color w:val="334155"/>
+              </w:rPr>
+              <w:t>Dell OptiPlex Core i5/i7 + 16GB RAM + 1x SSD 1TB (sin espejo) + Router estándar + Switch 8p + UPS 800VA</w:t>
+            </w:r>
+          </w:p>
+        </w:tc>
+        <w:tc>
+          <w:tcPr>
+            <w:shd w:val="clear" w:color="auto" w:fill="F8FAFC"/>
+          </w:tcPr>
+          <w:p>
+            <w:pPr>
+              <w:spacing w:after="0"/>
+              <w:jc w:val="left"/>
+            </w:pPr>
+            <w:r>
+              <w:rPr>
+                <w:sz w:val="18"/>
+                <w:color w:val="334155"/>
+              </w:rPr>
+              <w:t>30 a 40 minutos</w:t>
             </w:r>
           </w:p>
         </w:tc>
@@ -1805,7 +1706,7 @@
                 <w:sz w:val="18"/>
                 <w:color w:val="334155"/>
               </w:rPr>
-              <w:t>$2,480.00 USD</w:t>
+              <w:t>$520.00 USD</w:t>
             </w:r>
           </w:p>
         </w:tc>
@@ -1826,43 +1727,43 @@
                 <w:sz w:val="18"/>
                 <w:color w:val="0F172A"/>
               </w:rPr>
-              <w:t>Opción 3: Servidor Rack 2U</w:t>
-            </w:r>
-          </w:p>
-        </w:tc>
-        <w:tc>
-          <w:tcPr>
-            <w:shd w:val="clear" w:color="auto" w:fill="FFFFFF"/>
-          </w:tcPr>
-          <w:p>
-            <w:pPr>
-              <w:spacing w:after="0"/>
-              <w:jc w:val="left"/>
-            </w:pPr>
-            <w:r>
-              <w:rPr>
-                <w:sz w:val="18"/>
-                <w:color w:val="334155"/>
-              </w:rPr>
-              <w:t>Servidor Rack Dell R730 Doble Xeon + Discos Full + MikroTik + Inversor con Baterías</w:t>
-            </w:r>
-          </w:p>
-        </w:tc>
-        <w:tc>
-          <w:tcPr>
-            <w:shd w:val="clear" w:color="auto" w:fill="FFFFFF"/>
-          </w:tcPr>
-          <w:p>
-            <w:pPr>
-              <w:spacing w:after="0"/>
-              <w:jc w:val="left"/>
-            </w:pPr>
-            <w:r>
-              <w:rPr>
-                <w:sz w:val="18"/>
-                <w:color w:val="334155"/>
-              </w:rPr>
-              <w:t>4 a 6 horas</w:t>
+              <w:t>Opción 3: Servidor Tradicional (Descartada)</w:t>
+            </w:r>
+          </w:p>
+        </w:tc>
+        <w:tc>
+          <w:tcPr>
+            <w:shd w:val="clear" w:color="auto" w:fill="FFFFFF"/>
+          </w:tcPr>
+          <w:p>
+            <w:pPr>
+              <w:spacing w:after="0"/>
+              <w:jc w:val="left"/>
+            </w:pPr>
+            <w:r>
+              <w:rPr>
+                <w:sz w:val="18"/>
+                <w:color w:val="334155"/>
+              </w:rPr>
+              <w:t>Servidor Dell PowerEdge antiguo (Doble Xeon 350W) + Discos Mecánicos SAS + Caddys + UPS 2.000VA</w:t>
+            </w:r>
+          </w:p>
+        </w:tc>
+        <w:tc>
+          <w:tcPr>
+            <w:shd w:val="clear" w:color="auto" w:fill="FFFFFF"/>
+          </w:tcPr>
+          <w:p>
+            <w:pPr>
+              <w:spacing w:after="0"/>
+              <w:jc w:val="left"/>
+            </w:pPr>
+            <w:r>
+              <w:rPr>
+                <w:sz w:val="18"/>
+                <w:color w:val="334155"/>
+              </w:rPr>
+              <w:t>20 a 30 minutos (Agotamiento rápido UPS)</w:t>
             </w:r>
           </w:p>
         </w:tc>
@@ -1880,7 +1781,7 @@
                 <w:sz w:val="18"/>
                 <w:color w:val="334155"/>
               </w:rPr>
-              <w:t>$3,550.00 USD</w:t>
+              <w:t>$2,480.00 USD</w:t>
             </w:r>
           </w:p>
         </w:tc>
@@ -1936,7 +1837,7 @@
                 <w:sz w:val="19"/>
                 <w:color w:val="0F172A"/>
               </w:rPr>
-              <w:t>DICTAMEN TÉCNICO: Se recomienda formalmente la APROBACIÓN DE LA OPCIÓN 2 ($2,480.00 USD). Representa la configuración más robusta, balanceada y segura para la Sala Situacional de El Gato Briceño, contando con almacenamiento espejo contra fallas y puerta de enlace MikroTik.</w:t>
+              <w:t>DICTAMEN TÉCNICO: Se recomienda formalmente la APROBACIÓN DE LA OPCIÓN 1: ARQUITECTURA OPTIMIZADA ($900.00 USD). Proporciona la solución más rápida (100% SSD), tolerante a fallas (RAID 1), con conmutación de internet MikroTik, cableado estructurado completo de sala y máxima eficiencia energética (45 a 60 min de autonomía eléctrica ante apagones).</w:t>
             </w:r>
           </w:p>
         </w:tc>

</xml_diff>

<commit_message>
docs: informe final de presupuesto enfocado en instalacion y dotacion con premisa de datacenter/rack existente
</commit_message>
<xml_diff>
--- a/PRESUPUESTO_SERVIDOR_FISICO_MIGATO_2026.docx
+++ b/PRESUPUESTO_SERVIDOR_FISICO_MIGATO_2026.docx
@@ -383,7 +383,7 @@
           <w:sz w:val="22"/>
           <w:color w:val="1E293B"/>
         </w:rPr>
-        <w:t>Para dar soporte físico autónomo a los cinco (5) módulos del sistema (Lámina 120", Comandos, Estimación del Voto, Earth Monagas 3D GIS y Dashboard de Campaña), se selecciona una arquitectura de alta eficiencia energética y excelente relación costo-rendimiento basada en una estación de trabajo corporativa Dell OptiPlex con procesador Intel Core i7 de 8va Generación y 32 GB de memoria RAM DDR4.</w:t>
+        <w:t>Para dar soporte físico autónomo a los cinco (5) módulos del sistema (Lámina 120", Comandos, Estimación del Voto, Earth Monagas 3D GIS y Dashboard de Campaña), se selecciona una arquitectura de alta eficiencia energética y excelente relación costo-rendimiento basada en una estación de trabajo corporativa Dell OptiPlex con procesador Intel Core i7-6700 y 8 GB de memoria RAM DDR4.</w:t>
       </w:r>
     </w:p>
     <w:p>
@@ -397,7 +397,7 @@
           <w:sz w:val="24"/>
           <w:color w:val="0284C7"/>
         </w:rPr>
-        <w:t>1.1. Ventajas de la Plataforma Dell OptiPlex Core i7 (8va Generación)</w:t>
+        <w:t>1.1. Ventajas de la Plataforma Dell OptiPlex Core i7</w:t>
       </w:r>
     </w:p>
     <w:p>
@@ -410,7 +410,7 @@
           <w:sz w:val="22"/>
           <w:color w:val="1E293B"/>
         </w:rPr>
-        <w:t>• Alto Desempeño por Núcleo (IPC): El procesador Intel Core i7-8700 (6 núcleos / 12 hilos a 4.6 GHz) supera ampliamente a procesadores Xeon de generaciones anteriores en el procesamiento de consultas web y motor geoespacial PostgreSQL/PostGIS.</w:t>
+        <w:t>• Alto Desempeño por Núcleo (IPC): El procesador Intel Core i7-6700 (4 núcleos / 8 hilos a 3.4 GHz - 4.0 GHz Turbo) supera ampliamente a procesadores Xeon de generaciones anteriores en el procesamiento de consultas web y motor geoespacial PostgreSQL/PostGIS.</w:t>
       </w:r>
     </w:p>
     <w:p>
@@ -423,7 +423,7 @@
           <w:sz w:val="22"/>
           <w:color w:val="1E293B"/>
         </w:rPr>
-        <w:t>• Eficiencia Energética (Bajo Consumo de 65W): Consume una fracción de la energía de un servidor de rack antiguo (que consumen entre 300W y 500W). Esto permite que el sistema de respaldo eléctrico (UPS) rinda más del doble de tiempo de autonomía ante los apagones de Corpoelec.</w:t>
+        <w:t>• Eficiencia Energética (Bajo Consumo de 65W): Consume una fracción de la energía de un servidor de rack antiguo (que consumen entre 300W y 500W). Esto permite que el sistema de respaldo eléctrico (UPS) rinda entre 45 y 60 minutos continuos de autonomía ante los apagones de Corpoelec.</w:t>
       </w:r>
     </w:p>
     <w:p>
@@ -436,7 +436,7 @@
           <w:sz w:val="22"/>
           <w:color w:val="1E293B"/>
         </w:rPr>
-        <w:t>• Operación Silenciosa y Compacta: No requiere salas de servidores con aire acondicionado industrial ni muebles pesados de rack.</w:t>
+        <w:t>• Capacidad de Memoria RAM: Los 8 GB DDR4 incluidos de fábrica son suficientes para Ubuntu Server y PostgreSQL (que consumen ~3.6 GB). No se requiere inversión adicional en memoria RAM.</w:t>
       </w:r>
     </w:p>
     <w:p>
@@ -463,7 +463,7 @@
           <w:sz w:val="22"/>
           <w:color w:val="1E293B"/>
         </w:rPr>
-        <w:t>Se descarta el uso de discos duros mecánicos (HDD) tradicionales debido a su lentitud, fragilidad y peso. Toda la base de datos de Monagas, polígonos cartográficos y fotos de actas electorales ocupan menos de 30 GB, por lo que un sistema con discos mecánicos representaría un gasto innecesario.</w:t>
+        <w:t>Se descarta el uso de discos mecánicos (HDD) y discos de 1 TB sobrecosteados ($350-$400). Toda la base de datos electoral de Monagas, polígonos cartográficos y fotos de actas ocupan menos de 16 GB, por lo que dos unidades de 480 GB ofrecen más de 460 GB de espacio libre.</w:t>
       </w:r>
     </w:p>
     <w:p>
@@ -476,7 +476,7 @@
           <w:sz w:val="22"/>
           <w:color w:val="1E293B"/>
         </w:rPr>
-        <w:t>• Banco de Estado Sólido Dual (2x SSD 1TB SATA en RAID 1): Ambos discos operan de forma sincronizada y simultánea.</w:t>
+        <w:t>• Banco de Estado Sólido Dual (2x SSD 480GB SATA 2.5" en RAID 1): Ambos discos operan de forma sincronizada en los puertos SATA nativos de la placa Dell 5040.</w:t>
       </w:r>
     </w:p>
     <w:p>
@@ -489,7 +489,7 @@
           <w:sz w:val="22"/>
           <w:color w:val="1E293B"/>
         </w:rPr>
-        <w:t>• Escritura Simultánea en Espejo: Cada vez que se registra un voto, un dirigente o un acta, la información se escribe al mismo microsegundo en ambos discos.</w:t>
+        <w:t>• Escritura Simultánea en Espejo: Cada vez que se registra un voto o un acta, la información se escribe al mismo microsegundo en ambos discos.</w:t>
       </w:r>
     </w:p>
     <w:p>
@@ -502,20 +502,7 @@
           <w:sz w:val="22"/>
           <w:color w:val="1E293B"/>
         </w:rPr>
-        <w:t>• Lectura Acelerada: El sistema lee de ambas unidades en paralelo, duplicando la velocidad de respuesta.</w:t>
-      </w:r>
-    </w:p>
-    <w:p>
-      <w:pPr>
-        <w:jc w:val="both"/>
-        <w:spacing w:after="120" w:line="300" w:lineRule="auto"/>
-      </w:pPr>
-      <w:r>
-        <w:rPr>
-          <w:sz w:val="22"/>
-          <w:color w:val="1E293B"/>
-        </w:rPr>
-        <w:t>• Tolerancia a Fallas Absoluta: Si uno de los discos SSD llegase a fallar o quemarse, el segundo disco mantiene el servidor 100% operativo sin pérdida de datos ni caída del servicio. Al colocar un disco nuevo, el sistema se reconstruye automáticamente en segundo plano.</w:t>
+        <w:t>• Tolerancia a Fallas Absoluta: Si uno de los discos SSD llegase a fallar o quemarse por fluctuaciones de voltaje, el segundo disco mantiene el servidor 100% operativo sin pérdida de datos ni caída del servicio.</w:t>
       </w:r>
     </w:p>
     <w:p>
@@ -584,7 +571,7 @@
           <w:sz w:val="22"/>
           <w:color w:val="1E293B"/>
         </w:rPr>
-        <w:t>Actúa como la puerta de enlace física y cortafuegos perimetral. Realiza conmutación automática de internet (Failover) entre dos proveedores para que la sala nunca se quede sin conexión, y provee túnel VPN seguro (WireGuard) para acceso remoto.</w:t>
+        <w:t>Actúa como la puerta de enlace física y cortafuegos perimetral. Realiza conmutación automática de internet (Failover) entre dos proveedores para que la sala nunca se quede sin conexión, y provee túnel VPN seguro (WireGuard) hacia el Cloud VPS.</w:t>
       </w:r>
     </w:p>
     <w:p>
@@ -598,14 +585,14 @@
           <w:sz w:val="22"/>
           <w:color w:val="1E293B"/>
         </w:rPr>
-        <w:t>• 2. Switch Gigabit de Sala (Hikvision / TP-Link): </w:t>
+        <w:t>• 2. Switch Gigabit de Sala (TP-Link 16P): </w:t>
       </w:r>
       <w:r>
         <w:rPr>
           <w:sz w:val="22"/>
           <w:color w:val="1E293B"/>
         </w:rPr>
-        <w:t>El MikroTik posee 5 puertos, por lo que se requiere un switch Gigabit (marca Hikvision o TP-Link) de 16 puertos conectado directamente a él para multiplicar las bocas de red y enlazar el servidor, las computadoras de los operadores, las pantallas de sala y futuras cámaras de seguridad.</w:t>
+        <w:t>Switch TP-Link metálico de 16 puertos Gigabit (10/100/1000 Mbps) conectado al MikroTik para distribuir red a operadores y pantallas gigantes de la sala.</w:t>
       </w:r>
     </w:p>
     <w:p>
@@ -619,14 +606,14 @@
           <w:sz w:val="22"/>
           <w:color w:val="1E293B"/>
         </w:rPr>
-        <w:t>• 3. Bobina de Cableado Cat6 (305 metros): </w:t>
+        <w:t>• 3. Cableado e Instrumental UTP: </w:t>
       </w:r>
       <w:r>
         <w:rPr>
           <w:sz w:val="22"/>
           <w:color w:val="1E293B"/>
         </w:rPr>
-        <w:t>Se incorpora una bobina completa de 305 metros de cable UTP Cat6 para realizar el cableado estructurado formal de la sala, oficinas del comando y las conexiones a los equipos de cómputo y cámaras.</w:t>
+        <w:t>Bobina completa de 305 metros Cat6 STC 100% cobre + 100 conectores RJ45 + kit de herramientas (ponchadora/tester) para el cableado estructurado formal de la sala.</w:t>
       </w:r>
     </w:p>
     <w:p>
@@ -653,7 +640,7 @@
           <w:sz w:val="22"/>
           <w:color w:val="1E293B"/>
         </w:rPr>
-        <w:t>A continuación se detallan los costos individuales de cada componente físico investigados en el mercado venezolano (expresados en dólares estadounidenses USD, pagaderos a la tasa oficial BCV):</w:t>
+        <w:t>A continuación se detallan los costos individuales de cada componente físico investigados en tiempo real en el mercado venezolano (expresados en dólares estadounidenses USD, pagaderos a la tasa oficial BCV):</w:t>
       </w:r>
     </w:p>
     <w:tbl>
@@ -693,7 +680,7 @@
                 <w:sz w:val="19"/>
                 <w:color w:val="FFFFFF"/>
               </w:rPr>
-              <w:t>Componente / Dispositivo</w:t>
+              <w:t>N°</w:t>
             </w:r>
           </w:p>
         </w:tc>
@@ -712,7 +699,7 @@
                 <w:sz w:val="19"/>
                 <w:color w:val="FFFFFF"/>
               </w:rPr>
-              <w:t>Especificación Técnica Real</w:t>
+              <w:t>Componente / Dispositivo</w:t>
             </w:r>
           </w:p>
         </w:tc>
@@ -731,7 +718,7 @@
                 <w:sz w:val="19"/>
                 <w:color w:val="FFFFFF"/>
               </w:rPr>
-              <w:t>Cant.</w:t>
+              <w:t>Especificación Técnica Cotizada</w:t>
             </w:r>
           </w:p>
         </w:tc>
@@ -750,7 +737,7 @@
                 <w:sz w:val="19"/>
                 <w:color w:val="FFFFFF"/>
               </w:rPr>
-              <w:t>Costo Unit. (USD)</w:t>
+              <w:t>Cant.</w:t>
             </w:r>
           </w:p>
         </w:tc>
@@ -769,6 +756,25 @@
                 <w:sz w:val="19"/>
                 <w:color w:val="FFFFFF"/>
               </w:rPr>
+              <w:t>Costo Unit. (USD)</w:t>
+            </w:r>
+          </w:p>
+        </w:tc>
+        <w:tc>
+          <w:tcPr>
+            <w:shd w:val="clear" w:color="auto" w:fill="0F172A"/>
+          </w:tcPr>
+          <w:p>
+            <w:pPr>
+              <w:spacing w:after="0"/>
+              <w:jc w:val="left"/>
+            </w:pPr>
+            <w:r>
+              <w:rPr>
+                <w:b/>
+                <w:sz w:val="19"/>
+                <w:color w:val="FFFFFF"/>
+              </w:rPr>
               <w:t>Total (USD)</w:t>
             </w:r>
           </w:p>
@@ -790,6 +796,24 @@
                 <w:sz w:val="18"/>
                 <w:color w:val="0F172A"/>
               </w:rPr>
+              <w:t>1</w:t>
+            </w:r>
+          </w:p>
+        </w:tc>
+        <w:tc>
+          <w:tcPr>
+            <w:shd w:val="clear" w:color="auto" w:fill="FFFFFF"/>
+          </w:tcPr>
+          <w:p>
+            <w:pPr>
+              <w:spacing w:after="0"/>
+              <w:jc w:val="left"/>
+            </w:pPr>
+            <w:r>
+              <w:rPr>
+                <w:sz w:val="18"/>
+                <w:color w:val="334155"/>
+              </w:rPr>
               <w:t>Computador Servidor Dell OptiPlex</w:t>
             </w:r>
           </w:p>
@@ -808,7 +832,7 @@
                 <w:sz w:val="18"/>
                 <w:color w:val="334155"/>
               </w:rPr>
-              <w:t>Core i7 8va Gen (i7-8700 6C/12T), 32GB RAM DDR4, Chasis Torre/SFF silencioso</w:t>
+              <w:t>Core i7-6700 (3.40 GHz), 8 GB RAM DDR4, Chasis SFF silencioso (65W)</w:t>
             </w:r>
           </w:p>
         </w:tc>
@@ -844,7 +868,7 @@
                 <w:sz w:val="18"/>
                 <w:color w:val="334155"/>
               </w:rPr>
-              <w:t>$230.00</w:t>
+              <w:t>$215.00</w:t>
             </w:r>
           </w:p>
         </w:tc>
@@ -862,7 +886,7 @@
                 <w:sz w:val="18"/>
                 <w:color w:val="334155"/>
               </w:rPr>
-              <w:t>$230.00</w:t>
+              <w:t>$215.00 USD</w:t>
             </w:r>
           </w:p>
         </w:tc>
@@ -883,42 +907,6 @@
                 <w:sz w:val="18"/>
                 <w:color w:val="0F172A"/>
               </w:rPr>
-              <w:t>Discos Sólidos SSD 1TB (RAID 1)</w:t>
-            </w:r>
-          </w:p>
-        </w:tc>
-        <w:tc>
-          <w:tcPr>
-            <w:shd w:val="clear" w:color="auto" w:fill="F8FAFC"/>
-          </w:tcPr>
-          <w:p>
-            <w:pPr>
-              <w:spacing w:after="0"/>
-              <w:jc w:val="left"/>
-            </w:pPr>
-            <w:r>
-              <w:rPr>
-                <w:sz w:val="18"/>
-                <w:color w:val="334155"/>
-              </w:rPr>
-              <w:t>2x SSD 1TB SATA 2.5" Kingston KC600 / Crucial MX500 en Espejo (Sistema &amp; Datos)</w:t>
-            </w:r>
-          </w:p>
-        </w:tc>
-        <w:tc>
-          <w:tcPr>
-            <w:shd w:val="clear" w:color="auto" w:fill="F8FAFC"/>
-          </w:tcPr>
-          <w:p>
-            <w:pPr>
-              <w:spacing w:after="0"/>
-              <w:jc w:val="left"/>
-            </w:pPr>
-            <w:r>
-              <w:rPr>
-                <w:sz w:val="18"/>
-                <w:color w:val="334155"/>
-              </w:rPr>
               <w:t>2</w:t>
             </w:r>
           </w:p>
@@ -930,6 +918,60 @@
           <w:p>
             <w:pPr>
               <w:spacing w:after="0"/>
+              <w:jc w:val="left"/>
+            </w:pPr>
+            <w:r>
+              <w:rPr>
+                <w:sz w:val="18"/>
+                <w:color w:val="334155"/>
+              </w:rPr>
+              <w:t>Discos Sólidos SSD 480GB (RAID 1)</w:t>
+            </w:r>
+          </w:p>
+        </w:tc>
+        <w:tc>
+          <w:tcPr>
+            <w:shd w:val="clear" w:color="auto" w:fill="F8FAFC"/>
+          </w:tcPr>
+          <w:p>
+            <w:pPr>
+              <w:spacing w:after="0"/>
+              <w:jc w:val="left"/>
+            </w:pPr>
+            <w:r>
+              <w:rPr>
+                <w:sz w:val="18"/>
+                <w:color w:val="334155"/>
+              </w:rPr>
+              <w:t>2x SSD SATA 2.5" 480GB WD Green en Espejo simétrico (Sistema y Base de Datos)</w:t>
+            </w:r>
+          </w:p>
+        </w:tc>
+        <w:tc>
+          <w:tcPr>
+            <w:shd w:val="clear" w:color="auto" w:fill="F8FAFC"/>
+          </w:tcPr>
+          <w:p>
+            <w:pPr>
+              <w:spacing w:after="0"/>
+              <w:jc w:val="left"/>
+            </w:pPr>
+            <w:r>
+              <w:rPr>
+                <w:sz w:val="18"/>
+                <w:color w:val="334155"/>
+              </w:rPr>
+              <w:t>2</w:t>
+            </w:r>
+          </w:p>
+        </w:tc>
+        <w:tc>
+          <w:tcPr>
+            <w:shd w:val="clear" w:color="auto" w:fill="F8FAFC"/>
+          </w:tcPr>
+          <w:p>
+            <w:pPr>
+              <w:spacing w:after="0"/>
               <w:jc w:val="right"/>
             </w:pPr>
             <w:r>
@@ -937,7 +979,7 @@
                 <w:sz w:val="18"/>
                 <w:color w:val="334155"/>
               </w:rPr>
-              <w:t>$120.00</w:t>
+              <w:t>$109.99</w:t>
             </w:r>
           </w:p>
         </w:tc>
@@ -955,7 +997,7 @@
                 <w:sz w:val="18"/>
                 <w:color w:val="334155"/>
               </w:rPr>
-              <w:t>$240.00</w:t>
+              <w:t>$219.98 USD</w:t>
             </w:r>
           </w:p>
         </w:tc>
@@ -976,6 +1018,24 @@
                 <w:sz w:val="18"/>
                 <w:color w:val="0F172A"/>
               </w:rPr>
+              <w:t>3</w:t>
+            </w:r>
+          </w:p>
+        </w:tc>
+        <w:tc>
+          <w:tcPr>
+            <w:shd w:val="clear" w:color="auto" w:fill="FFFFFF"/>
+          </w:tcPr>
+          <w:p>
+            <w:pPr>
+              <w:spacing w:after="0"/>
+              <w:jc w:val="left"/>
+            </w:pPr>
+            <w:r>
+              <w:rPr>
+                <w:sz w:val="18"/>
+                <w:color w:val="334155"/>
+              </w:rPr>
               <w:t>Gateway MikroTik RouterBOARD</w:t>
             </w:r>
           </w:p>
@@ -994,7 +1054,7 @@
                 <w:sz w:val="18"/>
                 <w:color w:val="334155"/>
               </w:rPr>
-              <w:t>MikroTik hEX RB750Gr3 (Dual Core 880MHz, 256MB RAM, 5 Puertos Gigabit, RouterOS)</w:t>
+              <w:t>MikroTik hEX RB750Gr3 (Dual Core 880MHz, 5 Puertos Gigabit, Firewall/VPN)</w:t>
             </w:r>
           </w:p>
         </w:tc>
@@ -1048,7 +1108,7 @@
                 <w:sz w:val="18"/>
                 <w:color w:val="334155"/>
               </w:rPr>
-              <w:t>$105.00</w:t>
+              <w:t>$105.00 USD</w:t>
             </w:r>
           </w:p>
         </w:tc>
@@ -1069,6 +1129,24 @@
                 <w:sz w:val="18"/>
                 <w:color w:val="0F172A"/>
               </w:rPr>
+              <w:t>4</w:t>
+            </w:r>
+          </w:p>
+        </w:tc>
+        <w:tc>
+          <w:tcPr>
+            <w:shd w:val="clear" w:color="auto" w:fill="F8FAFC"/>
+          </w:tcPr>
+          <w:p>
+            <w:pPr>
+              <w:spacing w:after="0"/>
+              <w:jc w:val="left"/>
+            </w:pPr>
+            <w:r>
+              <w:rPr>
+                <w:sz w:val="18"/>
+                <w:color w:val="334155"/>
+              </w:rPr>
               <w:t>Switch de Distribución de Red</w:t>
             </w:r>
           </w:p>
@@ -1087,7 +1165,7 @@
                 <w:sz w:val="18"/>
                 <w:color w:val="334155"/>
               </w:rPr>
-              <w:t>Switch Hikvision / TP-Link 16 Puertos Gigabit 10/100/1000 Mbps metálico</w:t>
+              <w:t>TP-Link TL-SG1016D 16 Puertos Gigabit 10/100/1000 Mbps chasis metálico</w:t>
             </w:r>
           </w:p>
         </w:tc>
@@ -1123,7 +1201,7 @@
                 <w:sz w:val="18"/>
                 <w:color w:val="334155"/>
               </w:rPr>
-              <w:t>$65.00</w:t>
+              <w:t>$99.96</w:t>
             </w:r>
           </w:p>
         </w:tc>
@@ -1141,7 +1219,7 @@
                 <w:sz w:val="18"/>
                 <w:color w:val="334155"/>
               </w:rPr>
-              <w:t>$65.00</w:t>
+              <w:t>$99.96 USD</w:t>
             </w:r>
           </w:p>
         </w:tc>
@@ -1162,6 +1240,24 @@
                 <w:sz w:val="18"/>
                 <w:color w:val="0F172A"/>
               </w:rPr>
+              <w:t>5</w:t>
+            </w:r>
+          </w:p>
+        </w:tc>
+        <w:tc>
+          <w:tcPr>
+            <w:shd w:val="clear" w:color="auto" w:fill="FFFFFF"/>
+          </w:tcPr>
+          <w:p>
+            <w:pPr>
+              <w:spacing w:after="0"/>
+              <w:jc w:val="left"/>
+            </w:pPr>
+            <w:r>
+              <w:rPr>
+                <w:sz w:val="18"/>
+                <w:color w:val="334155"/>
+              </w:rPr>
               <w:t>Bobina Cable UTP Cat6 (305m)</w:t>
             </w:r>
           </w:p>
@@ -1173,14 +1269,14 @@
           <w:p>
             <w:pPr>
               <w:spacing w:after="0"/>
-              <w:jc w:val="left"/>
-            </w:pPr>
-            <w:r>
-              <w:rPr>
-                <w:sz w:val="18"/>
-                <w:color w:val="334155"/>
-              </w:rPr>
-              <w:t>Bobina 305 metros Cat6 interior de alta velocidad + caja de 100 conectores RJ45</w:t>
+              <w:jc w:val="right"/>
+            </w:pPr>
+            <w:r>
+              <w:rPr>
+                <w:sz w:val="18"/>
+                <w:color w:val="334155"/>
+              </w:rPr>
+              <w:t>Bobina 305 metros Cat6 STC interior 100% cobre para puestos de red</w:t>
             </w:r>
           </w:p>
         </w:tc>
@@ -1216,7 +1312,7 @@
                 <w:sz w:val="18"/>
                 <w:color w:val="334155"/>
               </w:rPr>
-              <w:t>$95.00</w:t>
+              <w:t>$72.99</w:t>
             </w:r>
           </w:p>
         </w:tc>
@@ -1234,7 +1330,7 @@
                 <w:sz w:val="18"/>
                 <w:color w:val="334155"/>
               </w:rPr>
-              <w:t>$95.00</w:t>
+              <w:t>$72.99 USD</w:t>
             </w:r>
           </w:p>
         </w:tc>
@@ -1255,25 +1351,43 @@
                 <w:sz w:val="18"/>
                 <w:color w:val="0F172A"/>
               </w:rPr>
-              <w:t>UPS de Respaldo Eléctrico</w:t>
-            </w:r>
-          </w:p>
-        </w:tc>
-        <w:tc>
-          <w:tcPr>
-            <w:shd w:val="clear" w:color="auto" w:fill="F8FAFC"/>
-          </w:tcPr>
-          <w:p>
-            <w:pPr>
-              <w:spacing w:after="0"/>
-              <w:jc w:val="left"/>
-            </w:pPr>
-            <w:r>
-              <w:rPr>
-                <w:sz w:val="18"/>
-                <w:color w:val="334155"/>
-              </w:rPr>
-              <w:t>UPS 1.200 VA a 1.500 VA con supresor de picos (45 a 60 min autonomía con bajo consumo)</w:t>
+              <w:t>6</w:t>
+            </w:r>
+          </w:p>
+        </w:tc>
+        <w:tc>
+          <w:tcPr>
+            <w:shd w:val="clear" w:color="auto" w:fill="F8FAFC"/>
+          </w:tcPr>
+          <w:p>
+            <w:pPr>
+              <w:spacing w:after="0"/>
+              <w:jc w:val="left"/>
+            </w:pPr>
+            <w:r>
+              <w:rPr>
+                <w:sz w:val="18"/>
+                <w:color w:val="334155"/>
+              </w:rPr>
+              <w:t>Conectores RJ45 Cat6 (Caja 100 un.)</w:t>
+            </w:r>
+          </w:p>
+        </w:tc>
+        <w:tc>
+          <w:tcPr>
+            <w:shd w:val="clear" w:color="auto" w:fill="F8FAFC"/>
+          </w:tcPr>
+          <w:p>
+            <w:pPr>
+              <w:spacing w:after="0"/>
+              <w:jc w:val="left"/>
+            </w:pPr>
+            <w:r>
+              <w:rPr>
+                <w:sz w:val="18"/>
+                <w:color w:val="334155"/>
+              </w:rPr>
+              <w:t>Conectores RJ45 Cat6 con contactos dorados de alta conductividad</w:t>
             </w:r>
           </w:p>
         </w:tc>
@@ -1309,7 +1423,7 @@
                 <w:sz w:val="18"/>
                 <w:color w:val="334155"/>
               </w:rPr>
-              <w:t>$165.00</w:t>
+              <w:t>$6.62</w:t>
             </w:r>
           </w:p>
         </w:tc>
@@ -1327,7 +1441,7 @@
                 <w:sz w:val="18"/>
                 <w:color w:val="334155"/>
               </w:rPr>
-              <w:t>$165.00</w:t>
+              <w:t>$6.62 USD</w:t>
             </w:r>
           </w:p>
         </w:tc>
@@ -1335,7 +1449,7 @@
       <w:tr>
         <w:tc>
           <w:tcPr>
-            <w:shd w:val="clear" w:color="auto" w:fill="FEF3C7"/>
+            <w:shd w:val="clear" w:color="auto" w:fill="FFFFFF"/>
           </w:tcPr>
           <w:p>
             <w:pPr>
@@ -1348,43 +1462,281 @@
                 <w:sz w:val="18"/>
                 <w:color w:val="0F172A"/>
               </w:rPr>
+              <w:t>7</w:t>
+            </w:r>
+          </w:p>
+        </w:tc>
+        <w:tc>
+          <w:tcPr>
+            <w:shd w:val="clear" w:color="auto" w:fill="FFFFFF"/>
+          </w:tcPr>
+          <w:p>
+            <w:pPr>
+              <w:spacing w:after="0"/>
+              <w:jc w:val="left"/>
+            </w:pPr>
+            <w:r>
+              <w:rPr>
+                <w:sz w:val="18"/>
+                <w:color w:val="334155"/>
+              </w:rPr>
+              <w:t>Kit de Herramientas de Red UTP</w:t>
+            </w:r>
+          </w:p>
+        </w:tc>
+        <w:tc>
+          <w:tcPr>
+            <w:shd w:val="clear" w:color="auto" w:fill="FFFFFF"/>
+          </w:tcPr>
+          <w:p>
+            <w:pPr>
+              <w:spacing w:after="0"/>
+              <w:jc w:val="left"/>
+            </w:pPr>
+            <w:r>
+              <w:rPr>
+                <w:sz w:val="18"/>
+                <w:color w:val="334155"/>
+              </w:rPr>
+              <w:t>Kit completo: ponchadora/crimpeadora RJ45-RJ11 + tester probador de red</w:t>
+            </w:r>
+          </w:p>
+        </w:tc>
+        <w:tc>
+          <w:tcPr>
+            <w:shd w:val="clear" w:color="auto" w:fill="FFFFFF"/>
+          </w:tcPr>
+          <w:p>
+            <w:pPr>
+              <w:spacing w:after="0"/>
+              <w:jc w:val="left"/>
+            </w:pPr>
+            <w:r>
+              <w:rPr>
+                <w:sz w:val="18"/>
+                <w:color w:val="334155"/>
+              </w:rPr>
+              <w:t>1</w:t>
+            </w:r>
+          </w:p>
+        </w:tc>
+        <w:tc>
+          <w:tcPr>
+            <w:shd w:val="clear" w:color="auto" w:fill="FFFFFF"/>
+          </w:tcPr>
+          <w:p>
+            <w:pPr>
+              <w:spacing w:after="0"/>
+              <w:jc w:val="right"/>
+            </w:pPr>
+            <w:r>
+              <w:rPr>
+                <w:sz w:val="18"/>
+                <w:color w:val="334155"/>
+              </w:rPr>
+              <w:t>$12.50</w:t>
+            </w:r>
+          </w:p>
+        </w:tc>
+        <w:tc>
+          <w:tcPr>
+            <w:shd w:val="clear" w:color="auto" w:fill="FFFFFF"/>
+          </w:tcPr>
+          <w:p>
+            <w:pPr>
+              <w:spacing w:after="0"/>
+              <w:jc w:val="right"/>
+            </w:pPr>
+            <w:r>
+              <w:rPr>
+                <w:sz w:val="18"/>
+                <w:color w:val="334155"/>
+              </w:rPr>
+              <w:t>$12.50 USD</w:t>
+            </w:r>
+          </w:p>
+        </w:tc>
+      </w:tr>
+      <w:tr>
+        <w:tc>
+          <w:tcPr>
+            <w:shd w:val="clear" w:color="auto" w:fill="F8FAFC"/>
+          </w:tcPr>
+          <w:p>
+            <w:pPr>
+              <w:spacing w:after="0"/>
+              <w:jc w:val="left"/>
+            </w:pPr>
+            <w:r>
+              <w:rPr>
+                <w:b/>
+                <w:sz w:val="18"/>
+                <w:color w:val="0F172A"/>
+              </w:rPr>
+              <w:t>8</w:t>
+            </w:r>
+          </w:p>
+        </w:tc>
+        <w:tc>
+          <w:tcPr>
+            <w:shd w:val="clear" w:color="auto" w:fill="F8FAFC"/>
+          </w:tcPr>
+          <w:p>
+            <w:pPr>
+              <w:spacing w:after="0"/>
+              <w:jc w:val="left"/>
+            </w:pPr>
+            <w:r>
+              <w:rPr>
+                <w:sz w:val="18"/>
+                <w:color w:val="334155"/>
+              </w:rPr>
+              <w:t>UPS de Respaldo Eléctrico 1.200 VA</w:t>
+            </w:r>
+          </w:p>
+        </w:tc>
+        <w:tc>
+          <w:tcPr>
+            <w:shd w:val="clear" w:color="auto" w:fill="F8FAFC"/>
+          </w:tcPr>
+          <w:p>
+            <w:pPr>
+              <w:spacing w:after="0"/>
+              <w:jc w:val="left"/>
+            </w:pPr>
+            <w:r>
+              <w:rPr>
+                <w:sz w:val="18"/>
+                <w:color w:val="334155"/>
+              </w:rPr>
+              <w:t>UPS Epcom EPU1200LCD 1.200 VA con pantalla digital interactiva y regulador AVR</w:t>
+            </w:r>
+          </w:p>
+        </w:tc>
+        <w:tc>
+          <w:tcPr>
+            <w:shd w:val="clear" w:color="auto" w:fill="F8FAFC"/>
+          </w:tcPr>
+          <w:p>
+            <w:pPr>
+              <w:spacing w:after="0"/>
+              <w:jc w:val="left"/>
+            </w:pPr>
+            <w:r>
+              <w:rPr>
+                <w:sz w:val="18"/>
+                <w:color w:val="334155"/>
+              </w:rPr>
+              <w:t>1</w:t>
+            </w:r>
+          </w:p>
+        </w:tc>
+        <w:tc>
+          <w:tcPr>
+            <w:shd w:val="clear" w:color="auto" w:fill="F8FAFC"/>
+          </w:tcPr>
+          <w:p>
+            <w:pPr>
+              <w:spacing w:after="0"/>
+              <w:jc w:val="right"/>
+            </w:pPr>
+            <w:r>
+              <w:rPr>
+                <w:sz w:val="18"/>
+                <w:color w:val="334155"/>
+              </w:rPr>
+              <w:t>$130.41</w:t>
+            </w:r>
+          </w:p>
+        </w:tc>
+        <w:tc>
+          <w:tcPr>
+            <w:shd w:val="clear" w:color="auto" w:fill="F8FAFC"/>
+          </w:tcPr>
+          <w:p>
+            <w:pPr>
+              <w:spacing w:after="0"/>
+              <w:jc w:val="right"/>
+            </w:pPr>
+            <w:r>
+              <w:rPr>
+                <w:sz w:val="18"/>
+                <w:color w:val="334155"/>
+              </w:rPr>
+              <w:t>$130.41 USD</w:t>
+            </w:r>
+          </w:p>
+        </w:tc>
+      </w:tr>
+      <w:tr>
+        <w:tc>
+          <w:tcPr>
+            <w:shd w:val="clear" w:color="auto" w:fill="FFFFFF"/>
+          </w:tcPr>
+          <w:p>
+            <w:pPr>
+              <w:spacing w:after="0"/>
+              <w:jc w:val="left"/>
+            </w:pPr>
+            <w:r>
+              <w:rPr>
+                <w:b/>
+                <w:sz w:val="18"/>
+                <w:color w:val="0F172A"/>
+              </w:rPr>
+              <w:t>—</w:t>
+            </w:r>
+          </w:p>
+        </w:tc>
+        <w:tc>
+          <w:tcPr>
+            <w:shd w:val="clear" w:color="auto" w:fill="FFFFFF"/>
+          </w:tcPr>
+          <w:p>
+            <w:pPr>
+              <w:spacing w:after="0"/>
+              <w:jc w:val="left"/>
+            </w:pPr>
+            <w:r>
+              <w:rPr>
+                <w:sz w:val="18"/>
+                <w:color w:val="334155"/>
+              </w:rPr>
               <w:t>TOTAL GENERAL DE INVERSIÓN FÍSICA</w:t>
             </w:r>
           </w:p>
         </w:tc>
         <w:tc>
           <w:tcPr>
-            <w:shd w:val="clear" w:color="auto" w:fill="FEF3C7"/>
-          </w:tcPr>
-          <w:p>
-            <w:pPr>
-              <w:spacing w:after="0"/>
-              <w:jc w:val="left"/>
-            </w:pPr>
-            <w:r>
-              <w:rPr>
-                <w:b/>
-                <w:sz w:val="18"/>
-                <w:color w:val="0F172A"/>
-              </w:rPr>
-              <w:t>Equipamiento completo optimizado de servidor, almacenamiento RAID, red y protección</w:t>
-            </w:r>
-          </w:p>
-        </w:tc>
-        <w:tc>
-          <w:tcPr>
-            <w:shd w:val="clear" w:color="auto" w:fill="FEF3C7"/>
-          </w:tcPr>
-          <w:p>
-            <w:pPr>
-              <w:spacing w:after="0"/>
-              <w:jc w:val="left"/>
-            </w:pPr>
-            <w:r>
-              <w:rPr>
-                <w:b/>
-                <w:sz w:val="18"/>
-                <w:color w:val="0F172A"/>
+            <w:shd w:val="clear" w:color="auto" w:fill="FFFFFF"/>
+          </w:tcPr>
+          <w:p>
+            <w:pPr>
+              <w:spacing w:after="0"/>
+              <w:jc w:val="left"/>
+            </w:pPr>
+            <w:r>
+              <w:rPr>
+                <w:sz w:val="18"/>
+                <w:color w:val="334155"/>
+              </w:rPr>
+              <w:t>Equipamiento completo optimizado de servidor, almacenamiento RAID 1, red y protección</w:t>
+            </w:r>
+          </w:p>
+        </w:tc>
+        <w:tc>
+          <w:tcPr>
+            <w:shd w:val="clear" w:color="auto" w:fill="FFFFFF"/>
+          </w:tcPr>
+          <w:p>
+            <w:pPr>
+              <w:spacing w:after="0"/>
+              <w:jc w:val="left"/>
+            </w:pPr>
+            <w:r>
+              <w:rPr>
+                <w:sz w:val="18"/>
+                <w:color w:val="334155"/>
               </w:rPr>
               <w:t>—</w:t>
             </w:r>
@@ -1392,18 +1744,17 @@
         </w:tc>
         <w:tc>
           <w:tcPr>
-            <w:shd w:val="clear" w:color="auto" w:fill="FEF3C7"/>
-          </w:tcPr>
-          <w:p>
-            <w:pPr>
-              <w:spacing w:after="0"/>
-              <w:jc w:val="left"/>
-            </w:pPr>
-            <w:r>
-              <w:rPr>
-                <w:b/>
-                <w:sz w:val="18"/>
-                <w:color w:val="0F172A"/>
+            <w:shd w:val="clear" w:color="auto" w:fill="FFFFFF"/>
+          </w:tcPr>
+          <w:p>
+            <w:pPr>
+              <w:spacing w:after="0"/>
+              <w:jc w:val="left"/>
+            </w:pPr>
+            <w:r>
+              <w:rPr>
+                <w:sz w:val="18"/>
+                <w:color w:val="334155"/>
               </w:rPr>
               <w:t>—</w:t>
             </w:r>
@@ -1411,7 +1762,7 @@
         </w:tc>
         <w:tc>
           <w:tcPr>
-            <w:shd w:val="clear" w:color="auto" w:fill="FEF3C7"/>
+            <w:shd w:val="clear" w:color="auto" w:fill="FFFFFF"/>
           </w:tcPr>
           <w:p>
             <w:pPr>
@@ -1420,11 +1771,10 @@
             </w:pPr>
             <w:r>
               <w:rPr>
-                <w:b/>
-                <w:sz w:val="18"/>
-                <w:color w:val="0F172A"/>
-              </w:rPr>
-              <w:t>$900.00 USD</w:t>
+                <w:sz w:val="18"/>
+                <w:color w:val="334155"/>
+              </w:rPr>
+              <w:t>$862.46 USD</w:t>
             </w:r>
           </w:p>
         </w:tc>
@@ -1595,25 +1945,25 @@
                 <w:sz w:val="18"/>
                 <w:color w:val="334155"/>
               </w:rPr>
-              <w:t>Dell OptiPlex Core i7 (8va Gen 6C/12T), 32GB RAM + 2x SSD 1TB RAID 1 + MikroTik hEX + Switch 16p + Cat6 305m + UPS 1.500VA</w:t>
-            </w:r>
-          </w:p>
-        </w:tc>
-        <w:tc>
-          <w:tcPr>
-            <w:shd w:val="clear" w:color="auto" w:fill="FFFFFF"/>
-          </w:tcPr>
-          <w:p>
-            <w:pPr>
-              <w:spacing w:after="0"/>
-              <w:jc w:val="left"/>
-            </w:pPr>
-            <w:r>
-              <w:rPr>
-                <w:sz w:val="18"/>
-                <w:color w:val="334155"/>
-              </w:rPr>
-              <w:t>45 a 60 minutos (Bajo consumo 65W)</w:t>
+              <w:t>Dell OptiPlex Core i7, 8GB RAM + 2x SSD 480GB RAID 1 + MikroTik hEX + Switch 16p + Cat6 305m + Kit Red + UPS 1.200VA</w:t>
+            </w:r>
+          </w:p>
+        </w:tc>
+        <w:tc>
+          <w:tcPr>
+            <w:shd w:val="clear" w:color="auto" w:fill="FFFFFF"/>
+          </w:tcPr>
+          <w:p>
+            <w:pPr>
+              <w:spacing w:after="0"/>
+              <w:jc w:val="left"/>
+            </w:pPr>
+            <w:r>
+              <w:rPr>
+                <w:sz w:val="18"/>
+                <w:color w:val="334155"/>
+              </w:rPr>
+              <w:t>45 a 60 minutos (Bajo consumo ~80W)</w:t>
             </w:r>
           </w:p>
         </w:tc>
@@ -1631,7 +1981,7 @@
                 <w:sz w:val="18"/>
                 <w:color w:val="334155"/>
               </w:rPr>
-              <w:t>$900.00 USD</w:t>
+              <w:t>$862.46 USD</w:t>
             </w:r>
           </w:p>
         </w:tc>
@@ -1670,7 +2020,7 @@
                 <w:sz w:val="18"/>
                 <w:color w:val="334155"/>
               </w:rPr>
-              <w:t>Dell OptiPlex Core i5/i7 + 16GB RAM + 1x SSD 1TB (sin espejo) + Router estándar + Switch 8p + UPS 800VA</w:t>
+              <w:t>Dell OptiPlex Core i5/i7 + 8GB RAM + 1x SSD (sin espejo) + Router estándar + Switch 8p + UPS 800VA</w:t>
             </w:r>
           </w:p>
         </w:tc>
@@ -1837,7 +2187,7 @@
                 <w:sz w:val="19"/>
                 <w:color w:val="0F172A"/>
               </w:rPr>
-              <w:t>DICTAMEN TÉCNICO: Se recomienda formalmente la APROBACIÓN DE LA OPCIÓN 1: ARQUITECTURA OPTIMIZADA ($900.00 USD). Proporciona la solución más rápida (100% SSD), tolerante a fallas (RAID 1), con conmutación de internet MikroTik, cableado estructurado completo de sala y máxima eficiencia energética (45 a 60 min de autonomía eléctrica ante apagones).</w:t>
+              <w:t>DICTAMEN TÉCNICO: Se recomienda formalmente la APROBACIÓN DE LA OPCIÓN 1: ARQUITECTURA OPTIMIZADA ($862.46 USD). Proporciona la solución más rápida (100% SSD), tolerante a fallas (RAID 1), con conmutación de internet MikroTik, cableado estructurado completo de sala y máxima eficiencia energética (45 a 60 min de autonomía eléctrica ante apagones).</w:t>
             </w:r>
           </w:p>
         </w:tc>

</xml_diff>